<commit_message>
Google Drive Integration and Template Synchronization
Organized templates for the Student and Coordinator portals based on course, track, and workflow stages. Integrated Google Drive synchronization to detect new and updated templates, with notifications to inform users about available changes.
</commit_message>
<xml_diff>
--- a/assets/papers/CAPSTONE/MIT Capstone Guidelines.docx
+++ b/assets/papers/CAPSTONE/MIT Capstone Guidelines.docx
@@ -741,6 +741,12 @@
       </w:pPr>
       <w:r>
         <w:rPr>
+          <w:rtl w:val="0"/>
+        </w:rPr>
+        <w:t xml:space="preserve">The project</w:t>
+      </w:r>
+      <w:r>
+        <w:rPr>
           <w:rFonts w:ascii="Calibri" w:cs="Calibri" w:eastAsia="Calibri" w:hAnsi="Calibri"/>
           <w:b w:val="0"/>
           <w:bCs w:val="0"/>
@@ -756,7 +762,7 @@
           <w:vertAlign w:val="baseline"/>
           <w:rtl w:val="0"/>
         </w:rPr>
-        <w:t xml:space="preserve">Project shall undergo Proposal and Final Presentation before endorsing for Conference Presentation.</w:t>
+        <w:t xml:space="preserve"> shall undergo Proposal and Final Presentation before endorsing for Conference Presentation.</w:t>
       </w:r>
     </w:p>
     <w:p>
@@ -2500,8 +2506,51 @@
           <w:szCs w:val="26"/>
         </w:rPr>
       </w:pPr>
-      <w:bookmarkStart w:colFirst="0" w:colLast="0" w:name="_as0l5a9rf7" w:id="2"/>
+      <w:bookmarkStart w:colFirst="0" w:colLast="0" w:name="_il2kf5dzd4g1" w:id="2"/>
       <w:bookmarkEnd w:id="2"/>
+      <w:r>
+        <w:br w:type="page"/>
+      </w:r>
+      <w:r>
+        <w:rPr>
+          <w:rtl w:val="0"/>
+        </w:rPr>
+      </w:r>
+    </w:p>
+    <w:p>
+      <w:pPr>
+        <w:pStyle w:val="Heading3"/>
+        <w:keepNext w:val="0"/>
+        <w:keepLines w:val="0"/>
+        <w:spacing w:line="240" w:lineRule="auto"/>
+        <w:ind w:left="0" w:firstLine="0"/>
+        <w:rPr>
+          <w:sz w:val="26"/>
+          <w:szCs w:val="26"/>
+        </w:rPr>
+      </w:pPr>
+      <w:bookmarkStart w:colFirst="0" w:colLast="0" w:name="_pyn2fvvx558m" w:id="3"/>
+      <w:bookmarkEnd w:id="3"/>
+      <w:r>
+        <w:rPr>
+          <w:rtl w:val="0"/>
+        </w:rPr>
+      </w:r>
+    </w:p>
+    <w:p>
+      <w:pPr>
+        <w:pStyle w:val="Heading3"/>
+        <w:keepNext w:val="0"/>
+        <w:keepLines w:val="0"/>
+        <w:spacing w:line="240" w:lineRule="auto"/>
+        <w:ind w:left="0" w:firstLine="0"/>
+        <w:rPr>
+          <w:sz w:val="26"/>
+          <w:szCs w:val="26"/>
+        </w:rPr>
+      </w:pPr>
+      <w:bookmarkStart w:colFirst="0" w:colLast="0" w:name="_as0l5a9rf7" w:id="4"/>
+      <w:bookmarkEnd w:id="4"/>
       <w:r>
         <w:rPr>
           <w:sz w:val="26"/>
@@ -3357,12 +3406,12 @@
           <wp:extent cx="767715" cy="762000"/>
           <wp:effectExtent b="0" l="0" r="0" t="0"/>
           <wp:wrapNone/>
-          <wp:docPr id="1" name="image1.png"/>
+          <wp:docPr id="1" name="image2.png"/>
           <a:graphic>
             <a:graphicData uri="http://schemas.openxmlformats.org/drawingml/2006/picture">
               <pic:pic>
                 <pic:nvPicPr>
-                  <pic:cNvPr id="0" name="image1.png"/>
+                  <pic:cNvPr id="0" name="image2.png"/>
                   <pic:cNvPicPr preferRelativeResize="0"/>
                 </pic:nvPicPr>
                 <pic:blipFill>
@@ -3399,12 +3448,12 @@
           <wp:extent cx="767715" cy="767715"/>
           <wp:effectExtent b="0" l="0" r="0" t="0"/>
           <wp:wrapNone/>
-          <wp:docPr id="2" name="image2.png"/>
+          <wp:docPr id="2" name="image1.png"/>
           <a:graphic>
             <a:graphicData uri="http://schemas.openxmlformats.org/drawingml/2006/picture">
               <pic:pic>
                 <pic:nvPicPr>
-                  <pic:cNvPr id="0" name="image2.png"/>
+                  <pic:cNvPr id="0" name="image1.png"/>
                   <pic:cNvPicPr preferRelativeResize="0"/>
                 </pic:nvPicPr>
                 <pic:blipFill>

</xml_diff>